<commit_message>
Updates the example scenarios to reflect recent changes in the spec
</commit_message>
<xml_diff>
--- a/scenarios/FastFedScenario_1B_with_SAML_and_SCIM.docx
+++ b/scenarios/FastFedScenario_1B_with_SAML_and_SCIM.docx
@@ -674,7 +674,25 @@
                 <w:sz w:val="18"/>
                 <w:szCs w:val="18"/>
               </w:rPr>
-              <w:t xml:space="preserve">     "provider_uri": "https://</w:t>
+              <w:t xml:space="preserve">     "provider_</w:t>
+            </w:r>
+            <w:r>
+              <w:rPr>
+                <w:rFonts w:ascii="Courier New" w:hAnsi="Courier New" w:cs="Courier New"/>
+                <w:noProof/>
+                <w:sz w:val="18"/>
+                <w:szCs w:val="18"/>
+              </w:rPr>
+              <w:t>domain_name</w:t>
+            </w:r>
+            <w:r>
+              <w:rPr>
+                <w:rFonts w:ascii="Courier New" w:hAnsi="Courier New" w:cs="Courier New"/>
+                <w:noProof/>
+                <w:sz w:val="18"/>
+                <w:szCs w:val="18"/>
+              </w:rPr>
+              <w:t>": "</w:t>
             </w:r>
             <w:r>
               <w:rPr>
@@ -757,7 +775,25 @@
                 <w:sz w:val="18"/>
                 <w:szCs w:val="18"/>
               </w:rPr>
-              <w:t xml:space="preserve">     "name": "</w:t>
+              <w:t xml:space="preserve">     "</w:t>
+            </w:r>
+            <w:r>
+              <w:rPr>
+                <w:rFonts w:ascii="Courier New" w:hAnsi="Courier New" w:cs="Courier New"/>
+                <w:noProof/>
+                <w:sz w:val="18"/>
+                <w:szCs w:val="18"/>
+              </w:rPr>
+              <w:t>display_</w:t>
+            </w:r>
+            <w:r>
+              <w:rPr>
+                <w:rFonts w:ascii="Courier New" w:hAnsi="Courier New" w:cs="Courier New"/>
+                <w:noProof/>
+                <w:sz w:val="18"/>
+                <w:szCs w:val="18"/>
+              </w:rPr>
+              <w:t>name": "</w:t>
             </w:r>
             <w:r>
               <w:rPr>
@@ -775,15 +811,6 @@
                 <w:sz w:val="18"/>
                 <w:szCs w:val="18"/>
               </w:rPr>
-              <w:t xml:space="preserve"> (Company.com)</w:t>
-            </w:r>
-            <w:r>
-              <w:rPr>
-                <w:rFonts w:ascii="Courier New" w:hAnsi="Courier New" w:cs="Courier New"/>
-                <w:noProof/>
-                <w:sz w:val="18"/>
-                <w:szCs w:val="18"/>
-              </w:rPr>
               <w:t>",</w:t>
             </w:r>
           </w:p>
@@ -803,26 +830,62 @@
                 <w:sz w:val="18"/>
                 <w:szCs w:val="18"/>
               </w:rPr>
-              <w:t xml:space="preserve">     "icons": {</w:t>
-            </w:r>
-          </w:p>
-          <w:p>
-            <w:pPr>
-              <w:rPr>
-                <w:rFonts w:ascii="Courier New" w:hAnsi="Courier New" w:cs="Courier New"/>
-                <w:noProof/>
-                <w:sz w:val="18"/>
-                <w:szCs w:val="18"/>
-              </w:rPr>
-            </w:pPr>
-            <w:r>
-              <w:rPr>
-                <w:rFonts w:ascii="Courier New" w:hAnsi="Courier New" w:cs="Courier New"/>
-                <w:noProof/>
-                <w:sz w:val="18"/>
-                <w:szCs w:val="18"/>
-              </w:rPr>
-              <w:t xml:space="preserve">       "large_icon_uri": "https://</w:t>
+              <w:t xml:space="preserve">     "</w:t>
+            </w:r>
+            <w:r>
+              <w:rPr>
+                <w:rFonts w:ascii="Courier New" w:hAnsi="Courier New" w:cs="Courier New"/>
+                <w:noProof/>
+                <w:sz w:val="18"/>
+                <w:szCs w:val="18"/>
+              </w:rPr>
+              <w:t>display_images</w:t>
+            </w:r>
+            <w:r>
+              <w:rPr>
+                <w:rFonts w:ascii="Courier New" w:hAnsi="Courier New" w:cs="Courier New"/>
+                <w:noProof/>
+                <w:sz w:val="18"/>
+                <w:szCs w:val="18"/>
+              </w:rPr>
+              <w:t>": {</w:t>
+            </w:r>
+          </w:p>
+          <w:p>
+            <w:pPr>
+              <w:rPr>
+                <w:rFonts w:ascii="Courier New" w:hAnsi="Courier New" w:cs="Courier New"/>
+                <w:noProof/>
+                <w:sz w:val="18"/>
+                <w:szCs w:val="18"/>
+              </w:rPr>
+            </w:pPr>
+            <w:r>
+              <w:rPr>
+                <w:rFonts w:ascii="Courier New" w:hAnsi="Courier New" w:cs="Courier New"/>
+                <w:noProof/>
+                <w:sz w:val="18"/>
+                <w:szCs w:val="18"/>
+              </w:rPr>
+              <w:t xml:space="preserve">       "l</w:t>
+            </w:r>
+            <w:r>
+              <w:rPr>
+                <w:rFonts w:ascii="Courier New" w:hAnsi="Courier New" w:cs="Courier New"/>
+                <w:noProof/>
+                <w:sz w:val="18"/>
+                <w:szCs w:val="18"/>
+              </w:rPr>
+              <w:t>ogo</w:t>
+            </w:r>
+            <w:r>
+              <w:rPr>
+                <w:rFonts w:ascii="Courier New" w:hAnsi="Courier New" w:cs="Courier New"/>
+                <w:noProof/>
+                <w:sz w:val="18"/>
+                <w:szCs w:val="18"/>
+              </w:rPr>
+              <w:t>_uri": "https://</w:t>
             </w:r>
             <w:r>
               <w:rPr>
@@ -840,26 +903,44 @@
                 <w:sz w:val="18"/>
                 <w:szCs w:val="18"/>
               </w:rPr>
-              <w:t>.com/images/tile.png",</w:t>
-            </w:r>
-          </w:p>
-          <w:p>
-            <w:pPr>
-              <w:rPr>
-                <w:rFonts w:ascii="Courier New" w:hAnsi="Courier New" w:cs="Courier New"/>
-                <w:noProof/>
-                <w:sz w:val="18"/>
-                <w:szCs w:val="18"/>
-              </w:rPr>
-            </w:pPr>
-            <w:r>
-              <w:rPr>
-                <w:rFonts w:ascii="Courier New" w:hAnsi="Courier New" w:cs="Courier New"/>
-                <w:noProof/>
-                <w:sz w:val="18"/>
-                <w:szCs w:val="18"/>
-              </w:rPr>
-              <w:t xml:space="preserve">       "small_icon_uri": "https://</w:t>
+              <w:t>.com/images/</w:t>
+            </w:r>
+            <w:r>
+              <w:rPr>
+                <w:rFonts w:ascii="Courier New" w:hAnsi="Courier New" w:cs="Courier New"/>
+                <w:noProof/>
+                <w:sz w:val="18"/>
+                <w:szCs w:val="18"/>
+              </w:rPr>
+              <w:t>logo</w:t>
+            </w:r>
+            <w:r>
+              <w:rPr>
+                <w:rFonts w:ascii="Courier New" w:hAnsi="Courier New" w:cs="Courier New"/>
+                <w:noProof/>
+                <w:sz w:val="18"/>
+                <w:szCs w:val="18"/>
+              </w:rPr>
+              <w:t>.png",</w:t>
+            </w:r>
+          </w:p>
+          <w:p>
+            <w:pPr>
+              <w:rPr>
+                <w:rFonts w:ascii="Courier New" w:hAnsi="Courier New" w:cs="Courier New"/>
+                <w:noProof/>
+                <w:sz w:val="18"/>
+                <w:szCs w:val="18"/>
+              </w:rPr>
+            </w:pPr>
+            <w:r>
+              <w:rPr>
+                <w:rFonts w:ascii="Courier New" w:hAnsi="Courier New" w:cs="Courier New"/>
+                <w:noProof/>
+                <w:sz w:val="18"/>
+                <w:szCs w:val="18"/>
+              </w:rPr>
+              <w:t xml:space="preserve">       "icon_uri": "https://</w:t>
             </w:r>
             <w:r>
               <w:rPr>
@@ -877,7 +958,7 @@
                 <w:sz w:val="18"/>
                 <w:szCs w:val="18"/>
               </w:rPr>
-              <w:t>.com/images/favicon.png"</w:t>
+              <w:t>.com/images/icon.png"</w:t>
             </w:r>
           </w:p>
           <w:p>
@@ -1498,7 +1579,27 @@
                 <w:sz w:val="18"/>
                 <w:szCs w:val="18"/>
               </w:rPr>
-              <w:t xml:space="preserve">  "iss": "https://</w:t>
+              <w:t xml:space="preserve">  "</w:t>
+            </w:r>
+            <w:bookmarkStart w:id="0" w:name="_GoBack"/>
+            <w:r>
+              <w:rPr>
+                <w:rFonts w:ascii="Courier New" w:hAnsi="Courier New" w:cs="Courier New"/>
+                <w:noProof/>
+                <w:sz w:val="18"/>
+                <w:szCs w:val="18"/>
+              </w:rPr>
+              <w:t>iss</w:t>
+            </w:r>
+            <w:bookmarkEnd w:id="0"/>
+            <w:r>
+              <w:rPr>
+                <w:rFonts w:ascii="Courier New" w:hAnsi="Courier New" w:cs="Courier New"/>
+                <w:noProof/>
+                <w:sz w:val="18"/>
+                <w:szCs w:val="18"/>
+              </w:rPr>
+              <w:t>": "</w:t>
             </w:r>
             <w:r>
               <w:rPr>
@@ -1554,7 +1655,7 @@
                 <w:sz w:val="18"/>
                 <w:szCs w:val="18"/>
               </w:rPr>
-              <w:t xml:space="preserve">  "aud": "https://</w:t>
+              <w:t xml:space="preserve">  "aud": "</w:t>
             </w:r>
             <w:r>
               <w:rPr>
@@ -1573,25 +1674,6 @@
                 <w:szCs w:val="18"/>
               </w:rPr>
               <w:t>.com",</w:t>
-            </w:r>
-          </w:p>
-          <w:p>
-            <w:pPr>
-              <w:rPr>
-                <w:rFonts w:ascii="Courier New" w:hAnsi="Courier New" w:cs="Courier New"/>
-                <w:noProof/>
-                <w:sz w:val="18"/>
-                <w:szCs w:val="18"/>
-              </w:rPr>
-            </w:pPr>
-            <w:r>
-              <w:rPr>
-                <w:rFonts w:ascii="Courier New" w:hAnsi="Courier New" w:cs="Courier New"/>
-                <w:noProof/>
-                <w:sz w:val="18"/>
-                <w:szCs w:val="18"/>
-              </w:rPr>
-              <w:t xml:space="preserve">  "state": "liK9x2fUOWoi1P0",</w:t>
             </w:r>
           </w:p>
           <w:p>
@@ -2064,44 +2146,44 @@
                 <w:sz w:val="18"/>
                 <w:szCs w:val="18"/>
               </w:rPr>
+              <w:t xml:space="preserve"> Host: tenant-67890.</w:t>
+            </w:r>
+            <w:r>
+              <w:rPr>
+                <w:rFonts w:ascii="Courier New" w:hAnsi="Courier New" w:cs="Courier New"/>
+                <w:noProof/>
+                <w:sz w:val="18"/>
+                <w:szCs w:val="18"/>
+              </w:rPr>
+              <w:t>onlineservice</w:t>
+            </w:r>
+            <w:r>
+              <w:rPr>
+                <w:rFonts w:ascii="Courier New" w:hAnsi="Courier New" w:cs="Courier New"/>
+                <w:noProof/>
+                <w:sz w:val="18"/>
+                <w:szCs w:val="18"/>
+              </w:rPr>
+              <w:t xml:space="preserve">.com </w:t>
+            </w:r>
+          </w:p>
+          <w:p>
+            <w:pPr>
+              <w:rPr>
+                <w:rFonts w:ascii="Courier New" w:hAnsi="Courier New" w:cs="Courier New"/>
+                <w:noProof/>
+                <w:sz w:val="18"/>
+                <w:szCs w:val="18"/>
+              </w:rPr>
+            </w:pPr>
+            <w:r>
+              <w:rPr>
+                <w:rFonts w:ascii="Courier New" w:hAnsi="Courier New" w:cs="Courier New"/>
+                <w:noProof/>
+                <w:sz w:val="18"/>
+                <w:szCs w:val="18"/>
+              </w:rPr>
               <w:lastRenderedPageBreak/>
-              <w:t xml:space="preserve"> Host: tenant-67890.</w:t>
-            </w:r>
-            <w:r>
-              <w:rPr>
-                <w:rFonts w:ascii="Courier New" w:hAnsi="Courier New" w:cs="Courier New"/>
-                <w:noProof/>
-                <w:sz w:val="18"/>
-                <w:szCs w:val="18"/>
-              </w:rPr>
-              <w:t>onlineservice</w:t>
-            </w:r>
-            <w:r>
-              <w:rPr>
-                <w:rFonts w:ascii="Courier New" w:hAnsi="Courier New" w:cs="Courier New"/>
-                <w:noProof/>
-                <w:sz w:val="18"/>
-                <w:szCs w:val="18"/>
-              </w:rPr>
-              <w:t xml:space="preserve">.com </w:t>
-            </w:r>
-          </w:p>
-          <w:p>
-            <w:pPr>
-              <w:rPr>
-                <w:rFonts w:ascii="Courier New" w:hAnsi="Courier New" w:cs="Courier New"/>
-                <w:noProof/>
-                <w:sz w:val="18"/>
-                <w:szCs w:val="18"/>
-              </w:rPr>
-            </w:pPr>
-            <w:r>
-              <w:rPr>
-                <w:rFonts w:ascii="Courier New" w:hAnsi="Courier New" w:cs="Courier New"/>
-                <w:noProof/>
-                <w:sz w:val="18"/>
-                <w:szCs w:val="18"/>
-              </w:rPr>
               <w:t xml:space="preserve"> Content-Type: application/json</w:t>
             </w:r>
           </w:p>
@@ -3333,7 +3415,25 @@
                 <w:sz w:val="18"/>
                 <w:szCs w:val="18"/>
               </w:rPr>
-              <w:t xml:space="preserve">     "provider_uri": "https://cloudprovider.com",</w:t>
+              <w:t xml:space="preserve">     "provider_</w:t>
+            </w:r>
+            <w:r>
+              <w:rPr>
+                <w:rFonts w:ascii="Courier New" w:hAnsi="Courier New" w:cs="Courier New"/>
+                <w:noProof/>
+                <w:sz w:val="18"/>
+                <w:szCs w:val="18"/>
+              </w:rPr>
+              <w:t>domain_name</w:t>
+            </w:r>
+            <w:r>
+              <w:rPr>
+                <w:rFonts w:ascii="Courier New" w:hAnsi="Courier New" w:cs="Courier New"/>
+                <w:noProof/>
+                <w:sz w:val="18"/>
+                <w:szCs w:val="18"/>
+              </w:rPr>
+              <w:t>": "cloudprovider.com",</w:t>
             </w:r>
           </w:p>
           <w:p>
@@ -3371,25 +3471,6 @@
                 <w:sz w:val="18"/>
                 <w:szCs w:val="18"/>
               </w:rPr>
-              <w:t xml:space="preserve">     "name": "Cloud Provider (Company.com)",</w:t>
-            </w:r>
-          </w:p>
-          <w:p>
-            <w:pPr>
-              <w:rPr>
-                <w:rFonts w:ascii="Courier New" w:hAnsi="Courier New" w:cs="Courier New"/>
-                <w:noProof/>
-                <w:sz w:val="18"/>
-                <w:szCs w:val="18"/>
-              </w:rPr>
-            </w:pPr>
-            <w:r>
-              <w:rPr>
-                <w:rFonts w:ascii="Courier New" w:hAnsi="Courier New" w:cs="Courier New"/>
-                <w:noProof/>
-                <w:sz w:val="18"/>
-                <w:szCs w:val="18"/>
-              </w:rPr>
               <w:t xml:space="preserve">     "jwks_uri": "https://cloudprovider.com/fastfed/keys",</w:t>
             </w:r>
           </w:p>
@@ -3409,45 +3490,136 @@
                 <w:sz w:val="18"/>
                 <w:szCs w:val="18"/>
               </w:rPr>
-              <w:t xml:space="preserve">     "icons": {</w:t>
-            </w:r>
-          </w:p>
-          <w:p>
-            <w:pPr>
-              <w:rPr>
-                <w:rFonts w:ascii="Courier New" w:hAnsi="Courier New" w:cs="Courier New"/>
-                <w:noProof/>
-                <w:sz w:val="18"/>
-                <w:szCs w:val="18"/>
-              </w:rPr>
-            </w:pPr>
-            <w:r>
-              <w:rPr>
-                <w:rFonts w:ascii="Courier New" w:hAnsi="Courier New" w:cs="Courier New"/>
-                <w:noProof/>
-                <w:sz w:val="18"/>
-                <w:szCs w:val="18"/>
-              </w:rPr>
-              <w:t xml:space="preserve">       "large_icon_uri": "https://cloudprovider.com/images/tile.png",</w:t>
-            </w:r>
-          </w:p>
-          <w:p>
-            <w:pPr>
-              <w:rPr>
-                <w:rFonts w:ascii="Courier New" w:hAnsi="Courier New" w:cs="Courier New"/>
-                <w:noProof/>
-                <w:sz w:val="18"/>
-                <w:szCs w:val="18"/>
-              </w:rPr>
-            </w:pPr>
-            <w:r>
-              <w:rPr>
-                <w:rFonts w:ascii="Courier New" w:hAnsi="Courier New" w:cs="Courier New"/>
-                <w:noProof/>
-                <w:sz w:val="18"/>
-                <w:szCs w:val="18"/>
-              </w:rPr>
-              <w:t xml:space="preserve">       "small_icon_uri": "https://cloudprovider.com/images/favicon.png"</w:t>
+              <w:t xml:space="preserve">     "</w:t>
+            </w:r>
+            <w:r>
+              <w:rPr>
+                <w:rFonts w:ascii="Courier New" w:hAnsi="Courier New" w:cs="Courier New"/>
+                <w:noProof/>
+                <w:sz w:val="18"/>
+                <w:szCs w:val="18"/>
+              </w:rPr>
+              <w:t>display_</w:t>
+            </w:r>
+            <w:r>
+              <w:rPr>
+                <w:rFonts w:ascii="Courier New" w:hAnsi="Courier New" w:cs="Courier New"/>
+                <w:noProof/>
+                <w:sz w:val="18"/>
+                <w:szCs w:val="18"/>
+              </w:rPr>
+              <w:t>name": "Cloud Provider",</w:t>
+            </w:r>
+          </w:p>
+          <w:p>
+            <w:pPr>
+              <w:rPr>
+                <w:rFonts w:ascii="Courier New" w:hAnsi="Courier New" w:cs="Courier New"/>
+                <w:noProof/>
+                <w:sz w:val="18"/>
+                <w:szCs w:val="18"/>
+              </w:rPr>
+            </w:pPr>
+            <w:r>
+              <w:rPr>
+                <w:rFonts w:ascii="Courier New" w:hAnsi="Courier New" w:cs="Courier New"/>
+                <w:noProof/>
+                <w:sz w:val="18"/>
+                <w:szCs w:val="18"/>
+              </w:rPr>
+              <w:t xml:space="preserve">     "</w:t>
+            </w:r>
+            <w:r>
+              <w:rPr>
+                <w:rFonts w:ascii="Courier New" w:hAnsi="Courier New" w:cs="Courier New"/>
+                <w:noProof/>
+                <w:sz w:val="18"/>
+                <w:szCs w:val="18"/>
+              </w:rPr>
+              <w:t>display_images</w:t>
+            </w:r>
+            <w:r>
+              <w:rPr>
+                <w:rFonts w:ascii="Courier New" w:hAnsi="Courier New" w:cs="Courier New"/>
+                <w:noProof/>
+                <w:sz w:val="18"/>
+                <w:szCs w:val="18"/>
+              </w:rPr>
+              <w:t>": {</w:t>
+            </w:r>
+          </w:p>
+          <w:p>
+            <w:pPr>
+              <w:rPr>
+                <w:rFonts w:ascii="Courier New" w:hAnsi="Courier New" w:cs="Courier New"/>
+                <w:noProof/>
+                <w:sz w:val="18"/>
+                <w:szCs w:val="18"/>
+              </w:rPr>
+            </w:pPr>
+            <w:r>
+              <w:rPr>
+                <w:rFonts w:ascii="Courier New" w:hAnsi="Courier New" w:cs="Courier New"/>
+                <w:noProof/>
+                <w:sz w:val="18"/>
+                <w:szCs w:val="18"/>
+              </w:rPr>
+              <w:t xml:space="preserve">       "l</w:t>
+            </w:r>
+            <w:r>
+              <w:rPr>
+                <w:rFonts w:ascii="Courier New" w:hAnsi="Courier New" w:cs="Courier New"/>
+                <w:noProof/>
+                <w:sz w:val="18"/>
+                <w:szCs w:val="18"/>
+              </w:rPr>
+              <w:t>ogo</w:t>
+            </w:r>
+            <w:r>
+              <w:rPr>
+                <w:rFonts w:ascii="Courier New" w:hAnsi="Courier New" w:cs="Courier New"/>
+                <w:noProof/>
+                <w:sz w:val="18"/>
+                <w:szCs w:val="18"/>
+              </w:rPr>
+              <w:t>_uri": "https://cloudprovider.com/images/</w:t>
+            </w:r>
+            <w:r>
+              <w:rPr>
+                <w:rFonts w:ascii="Courier New" w:hAnsi="Courier New" w:cs="Courier New"/>
+                <w:noProof/>
+                <w:sz w:val="18"/>
+                <w:szCs w:val="18"/>
+              </w:rPr>
+              <w:t>logo</w:t>
+            </w:r>
+            <w:r>
+              <w:rPr>
+                <w:rFonts w:ascii="Courier New" w:hAnsi="Courier New" w:cs="Courier New"/>
+                <w:noProof/>
+                <w:sz w:val="18"/>
+                <w:szCs w:val="18"/>
+              </w:rPr>
+              <w:t>.png",</w:t>
+            </w:r>
+          </w:p>
+          <w:p>
+            <w:pPr>
+              <w:rPr>
+                <w:rFonts w:ascii="Courier New" w:hAnsi="Courier New" w:cs="Courier New"/>
+                <w:noProof/>
+                <w:sz w:val="18"/>
+                <w:szCs w:val="18"/>
+              </w:rPr>
+            </w:pPr>
+            <w:r>
+              <w:rPr>
+                <w:rFonts w:ascii="Courier New" w:hAnsi="Courier New" w:cs="Courier New"/>
+                <w:noProof/>
+                <w:sz w:val="18"/>
+                <w:szCs w:val="18"/>
+              </w:rPr>
+              <w:t xml:space="preserve">       "icon_uri": "https://cloudprovider.com/images/icon.png"</w:t>
             </w:r>
           </w:p>
           <w:p>
@@ -4112,61 +4284,6 @@
                 <w:sz w:val="18"/>
                 <w:szCs w:val="18"/>
               </w:rPr>
-              <w:t xml:space="preserve">  </w:t>
-            </w:r>
-            <w:r>
-              <w:rPr>
-                <w:rFonts w:ascii="Courier New" w:hAnsi="Courier New" w:cs="Courier New"/>
-                <w:noProof/>
-                <w:sz w:val="18"/>
-                <w:szCs w:val="18"/>
-              </w:rPr>
-              <w:t xml:space="preserve"> &amp;</w:t>
-            </w:r>
-            <w:r>
-              <w:rPr>
-                <w:rFonts w:ascii="Courier New" w:hAnsi="Courier New" w:cs="Courier New"/>
-                <w:noProof/>
-                <w:sz w:val="18"/>
-                <w:szCs w:val="18"/>
-              </w:rPr>
-              <w:t>state</w:t>
-            </w:r>
-            <w:r>
-              <w:rPr>
-                <w:rFonts w:ascii="Courier New" w:hAnsi="Courier New" w:cs="Courier New"/>
-                <w:noProof/>
-                <w:sz w:val="18"/>
-                <w:szCs w:val="18"/>
-              </w:rPr>
-              <w:t>=</w:t>
-            </w:r>
-            <w:r>
-              <w:rPr>
-                <w:rFonts w:ascii="Courier New" w:hAnsi="Courier New" w:cs="Courier New"/>
-                <w:noProof/>
-                <w:sz w:val="18"/>
-                <w:szCs w:val="18"/>
-              </w:rPr>
-              <w:t>liK9x2fUOWoi1P0</w:t>
-            </w:r>
-          </w:p>
-          <w:p>
-            <w:pPr>
-              <w:rPr>
-                <w:rFonts w:ascii="Courier New" w:hAnsi="Courier New" w:cs="Courier New"/>
-                <w:noProof/>
-                <w:sz w:val="18"/>
-                <w:szCs w:val="18"/>
-              </w:rPr>
-            </w:pPr>
-            <w:r>
-              <w:rPr>
-                <w:rFonts w:ascii="Courier New" w:hAnsi="Courier New" w:cs="Courier New"/>
-                <w:noProof/>
-                <w:sz w:val="18"/>
-                <w:szCs w:val="18"/>
-              </w:rPr>
               <w:t xml:space="preserve">   </w:t>
             </w:r>
             <w:r>
@@ -4615,7 +4732,25 @@
                 <w:sz w:val="18"/>
                 <w:szCs w:val="18"/>
               </w:rPr>
-              <w:t xml:space="preserve">     "provider_uri": "https://</w:t>
+              <w:t xml:space="preserve">     "provider_</w:t>
+            </w:r>
+            <w:r>
+              <w:rPr>
+                <w:rFonts w:ascii="Courier New" w:hAnsi="Courier New" w:cs="Courier New"/>
+                <w:noProof/>
+                <w:sz w:val="18"/>
+                <w:szCs w:val="18"/>
+              </w:rPr>
+              <w:t>domain_name</w:t>
+            </w:r>
+            <w:r>
+              <w:rPr>
+                <w:rFonts w:ascii="Courier New" w:hAnsi="Courier New" w:cs="Courier New"/>
+                <w:noProof/>
+                <w:sz w:val="18"/>
+                <w:szCs w:val="18"/>
+              </w:rPr>
+              <w:t>": "</w:t>
             </w:r>
             <w:r>
               <w:rPr>
@@ -4689,16 +4824,34 @@
                 <w:sz w:val="18"/>
                 <w:szCs w:val="18"/>
               </w:rPr>
-              <w:t xml:space="preserve">     "name": "</w:t>
-            </w:r>
-            <w:r>
-              <w:rPr>
-                <w:rFonts w:ascii="Courier New" w:hAnsi="Courier New" w:cs="Courier New"/>
-                <w:noProof/>
-                <w:sz w:val="18"/>
-                <w:szCs w:val="18"/>
-              </w:rPr>
-              <w:t>Online Service (Company.com)</w:t>
+              <w:t xml:space="preserve">     "</w:t>
+            </w:r>
+            <w:r>
+              <w:rPr>
+                <w:rFonts w:ascii="Courier New" w:hAnsi="Courier New" w:cs="Courier New"/>
+                <w:noProof/>
+                <w:sz w:val="18"/>
+                <w:szCs w:val="18"/>
+              </w:rPr>
+              <w:t>display_</w:t>
+            </w:r>
+            <w:r>
+              <w:rPr>
+                <w:rFonts w:ascii="Courier New" w:hAnsi="Courier New" w:cs="Courier New"/>
+                <w:noProof/>
+                <w:sz w:val="18"/>
+                <w:szCs w:val="18"/>
+              </w:rPr>
+              <w:t>name": "</w:t>
+            </w:r>
+            <w:r>
+              <w:rPr>
+                <w:rFonts w:ascii="Courier New" w:hAnsi="Courier New" w:cs="Courier New"/>
+                <w:noProof/>
+                <w:sz w:val="18"/>
+                <w:szCs w:val="18"/>
+              </w:rPr>
+              <w:t>Online Service</w:t>
             </w:r>
             <w:r>
               <w:rPr>
@@ -4726,26 +4879,62 @@
                 <w:sz w:val="18"/>
                 <w:szCs w:val="18"/>
               </w:rPr>
-              <w:t xml:space="preserve">     "icons": {</w:t>
-            </w:r>
-          </w:p>
-          <w:p>
-            <w:pPr>
-              <w:rPr>
-                <w:rFonts w:ascii="Courier New" w:hAnsi="Courier New" w:cs="Courier New"/>
-                <w:noProof/>
-                <w:sz w:val="18"/>
-                <w:szCs w:val="18"/>
-              </w:rPr>
-            </w:pPr>
-            <w:r>
-              <w:rPr>
-                <w:rFonts w:ascii="Courier New" w:hAnsi="Courier New" w:cs="Courier New"/>
-                <w:noProof/>
-                <w:sz w:val="18"/>
-                <w:szCs w:val="18"/>
-              </w:rPr>
-              <w:t xml:space="preserve">       "large_icon_uri": "https://</w:t>
+              <w:t xml:space="preserve">     "</w:t>
+            </w:r>
+            <w:r>
+              <w:rPr>
+                <w:rFonts w:ascii="Courier New" w:hAnsi="Courier New" w:cs="Courier New"/>
+                <w:noProof/>
+                <w:sz w:val="18"/>
+                <w:szCs w:val="18"/>
+              </w:rPr>
+              <w:t>display_images</w:t>
+            </w:r>
+            <w:r>
+              <w:rPr>
+                <w:rFonts w:ascii="Courier New" w:hAnsi="Courier New" w:cs="Courier New"/>
+                <w:noProof/>
+                <w:sz w:val="18"/>
+                <w:szCs w:val="18"/>
+              </w:rPr>
+              <w:t>": {</w:t>
+            </w:r>
+          </w:p>
+          <w:p>
+            <w:pPr>
+              <w:rPr>
+                <w:rFonts w:ascii="Courier New" w:hAnsi="Courier New" w:cs="Courier New"/>
+                <w:noProof/>
+                <w:sz w:val="18"/>
+                <w:szCs w:val="18"/>
+              </w:rPr>
+            </w:pPr>
+            <w:r>
+              <w:rPr>
+                <w:rFonts w:ascii="Courier New" w:hAnsi="Courier New" w:cs="Courier New"/>
+                <w:noProof/>
+                <w:sz w:val="18"/>
+                <w:szCs w:val="18"/>
+              </w:rPr>
+              <w:t xml:space="preserve">       "l</w:t>
+            </w:r>
+            <w:r>
+              <w:rPr>
+                <w:rFonts w:ascii="Courier New" w:hAnsi="Courier New" w:cs="Courier New"/>
+                <w:noProof/>
+                <w:sz w:val="18"/>
+                <w:szCs w:val="18"/>
+              </w:rPr>
+              <w:t>ogo</w:t>
+            </w:r>
+            <w:r>
+              <w:rPr>
+                <w:rFonts w:ascii="Courier New" w:hAnsi="Courier New" w:cs="Courier New"/>
+                <w:noProof/>
+                <w:sz w:val="18"/>
+                <w:szCs w:val="18"/>
+              </w:rPr>
+              <w:t>_uri": "https://</w:t>
             </w:r>
             <w:r>
               <w:rPr>
@@ -4763,26 +4952,44 @@
                 <w:sz w:val="18"/>
                 <w:szCs w:val="18"/>
               </w:rPr>
-              <w:t>.com/images/tile.png",</w:t>
-            </w:r>
-          </w:p>
-          <w:p>
-            <w:pPr>
-              <w:rPr>
-                <w:rFonts w:ascii="Courier New" w:hAnsi="Courier New" w:cs="Courier New"/>
-                <w:noProof/>
-                <w:sz w:val="18"/>
-                <w:szCs w:val="18"/>
-              </w:rPr>
-            </w:pPr>
-            <w:r>
-              <w:rPr>
-                <w:rFonts w:ascii="Courier New" w:hAnsi="Courier New" w:cs="Courier New"/>
-                <w:noProof/>
-                <w:sz w:val="18"/>
-                <w:szCs w:val="18"/>
-              </w:rPr>
-              <w:t xml:space="preserve">       "small_icon_uri": "https://</w:t>
+              <w:t>.com/images/</w:t>
+            </w:r>
+            <w:r>
+              <w:rPr>
+                <w:rFonts w:ascii="Courier New" w:hAnsi="Courier New" w:cs="Courier New"/>
+                <w:noProof/>
+                <w:sz w:val="18"/>
+                <w:szCs w:val="18"/>
+              </w:rPr>
+              <w:t>logo</w:t>
+            </w:r>
+            <w:r>
+              <w:rPr>
+                <w:rFonts w:ascii="Courier New" w:hAnsi="Courier New" w:cs="Courier New"/>
+                <w:noProof/>
+                <w:sz w:val="18"/>
+                <w:szCs w:val="18"/>
+              </w:rPr>
+              <w:t>.png",</w:t>
+            </w:r>
+          </w:p>
+          <w:p>
+            <w:pPr>
+              <w:rPr>
+                <w:rFonts w:ascii="Courier New" w:hAnsi="Courier New" w:cs="Courier New"/>
+                <w:noProof/>
+                <w:sz w:val="18"/>
+                <w:szCs w:val="18"/>
+              </w:rPr>
+            </w:pPr>
+            <w:r>
+              <w:rPr>
+                <w:rFonts w:ascii="Courier New" w:hAnsi="Courier New" w:cs="Courier New"/>
+                <w:noProof/>
+                <w:sz w:val="18"/>
+                <w:szCs w:val="18"/>
+              </w:rPr>
+              <w:t xml:space="preserve">       "icon_uri": "https://</w:t>
             </w:r>
             <w:r>
               <w:rPr>
@@ -4800,7 +5007,7 @@
                 <w:sz w:val="18"/>
                 <w:szCs w:val="18"/>
               </w:rPr>
-              <w:t>.com/images/favicon.png"</w:t>
+              <w:t>.com/images/icon.png"</w:t>
             </w:r>
           </w:p>
           <w:p>
@@ -5347,6 +5554,7 @@
     <w:p/>
     <w:p>
       <w:r>
+        <w:lastRenderedPageBreak/>
         <w:t xml:space="preserve">If the </w:t>
       </w:r>
       <w:r>
@@ -5468,7 +5676,7 @@
                 <w:sz w:val="18"/>
                 <w:szCs w:val="18"/>
               </w:rPr>
-              <w:t xml:space="preserve">  "iss": "https://</w:t>
+              <w:t xml:space="preserve">  "iss": "</w:t>
             </w:r>
             <w:r>
               <w:rPr>
@@ -5524,7 +5732,7 @@
                 <w:sz w:val="18"/>
                 <w:szCs w:val="18"/>
               </w:rPr>
-              <w:t xml:space="preserve">  "aud": "https://</w:t>
+              <w:t xml:space="preserve">  "aud": "</w:t>
             </w:r>
             <w:r>
               <w:rPr>
@@ -5543,25 +5751,6 @@
                 <w:szCs w:val="18"/>
               </w:rPr>
               <w:t>.com",</w:t>
-            </w:r>
-          </w:p>
-          <w:p>
-            <w:pPr>
-              <w:rPr>
-                <w:rFonts w:ascii="Courier New" w:hAnsi="Courier New" w:cs="Courier New"/>
-                <w:noProof/>
-                <w:sz w:val="18"/>
-                <w:szCs w:val="18"/>
-              </w:rPr>
-            </w:pPr>
-            <w:r>
-              <w:rPr>
-                <w:rFonts w:ascii="Courier New" w:hAnsi="Courier New" w:cs="Courier New"/>
-                <w:noProof/>
-                <w:sz w:val="18"/>
-                <w:szCs w:val="18"/>
-              </w:rPr>
-              <w:t xml:space="preserve">  "state": "liK9x2fUOWoi1P0",</w:t>
             </w:r>
           </w:p>
           <w:p>
@@ -6461,7 +6650,6 @@
     <w:p/>
     <w:p>
       <w:r>
-        <w:lastRenderedPageBreak/>
         <w:t xml:space="preserve">To verify whether this is permitted, OnlineService.com consults it’s whitelisting datastore and confirms that Alice consented to enabling provisioning for the Identity Provider. </w:t>
       </w:r>
     </w:p>
@@ -6491,6 +6679,7 @@
           <w:sz w:val="28"/>
           <w:szCs w:val="28"/>
         </w:rPr>
+        <w:lastRenderedPageBreak/>
         <w:t xml:space="preserve">Step </w:t>
       </w:r>
       <w:r>
@@ -7161,8 +7350,6 @@
               </w:rPr>
               <w:t xml:space="preserve"> }</w:t>
             </w:r>
-            <w:bookmarkStart w:id="0" w:name="_GoBack"/>
-            <w:bookmarkEnd w:id="0"/>
           </w:p>
         </w:tc>
       </w:tr>
@@ -9248,7 +9435,7 @@
 </file>
 
 <file path=customXml/itemProps1.xml><?xml version="1.0" encoding="utf-8"?>
-<ds:datastoreItem xmlns:ds="http://schemas.openxmlformats.org/officeDocument/2006/customXml" ds:itemID="{4AA06F73-1282-D344-9ADE-D34E195A1941}">
+<ds:datastoreItem xmlns:ds="http://schemas.openxmlformats.org/officeDocument/2006/customXml" ds:itemID="{EBF81009-2050-7243-A0E5-4668DFA48029}">
   <ds:schemaRefs>
     <ds:schemaRef ds:uri="http://schemas.openxmlformats.org/officeDocument/2006/bibliography"/>
   </ds:schemaRefs>

</xml_diff>